<commit_message>
chore: remove unused logo and refresh release docs
Agent-Logs-Url: https://github.com/kostyaluch/Photo-quality-checker/sessions/9b27d0a8-c3c3-49ae-93b2-f6fa59f23747

Co-authored-by: kostyaluch <180518886+kostyaluch@users.noreply.github.com>
</commit_message>
<xml_diff>
--- a/Інструкція користувача.docx
+++ b/Інструкція користувача.docx
@@ -26,7 +26,7 @@
           <w:color w:val="1E293B"/>
           <w:sz w:val="32"/>
         </w:rPr>
-        <w:t>Детальна інструкція користувача</w:t>
+        <w:t>Детальна інструкція користувача · Версія 1.1 · 2026</w:t>
       </w:r>
       <w:r>
         <w:br w:type="page"/>
@@ -112,13 +112,12 @@
           <w:color w:val="2563EB"/>
           <w:lang w:val="ru-RU"/>
         </w:rPr>
-        <w:t xml:space="preserve">4.  </w:t>
-      </w:r>
-      <w:r>
-        <w:rPr>
-          <w:lang w:val="ru-RU"/>
-        </w:rPr>
-        <w:t>Опис інтерфейсу</w:t>
+        <w:t>3.  Опис інтерфейсу</w:t>
+      </w:r>
+      <w:r>
+        <w:rPr>
+          <w:lang w:val="ru-RU"/>
+        </w:rPr>
       </w:r>
     </w:p>
     <w:p>
@@ -134,13 +133,12 @@
           <w:color w:val="2563EB"/>
           <w:lang w:val="ru-RU"/>
         </w:rPr>
-        <w:t xml:space="preserve">5.  </w:t>
-      </w:r>
-      <w:r>
-        <w:rPr>
-          <w:lang w:val="ru-RU"/>
-        </w:rPr>
-        <w:t>Підготовка вхідних даних</w:t>
+        <w:t>4.  Підготовка вхідних даних</w:t>
+      </w:r>
+      <w:r>
+        <w:rPr>
+          <w:lang w:val="ru-RU"/>
+        </w:rPr>
       </w:r>
     </w:p>
     <w:p>
@@ -156,13 +154,12 @@
           <w:color w:val="2563EB"/>
           <w:lang w:val="ru-RU"/>
         </w:rPr>
-        <w:t xml:space="preserve">6.  </w:t>
-      </w:r>
-      <w:r>
-        <w:rPr>
-          <w:lang w:val="ru-RU"/>
-        </w:rPr>
-        <w:t>Налаштування вимог до якості</w:t>
+        <w:t>5.  Налаштування вимог до якості</w:t>
+      </w:r>
+      <w:r>
+        <w:rPr>
+          <w:lang w:val="ru-RU"/>
+        </w:rPr>
       </w:r>
     </w:p>
     <w:p>
@@ -178,13 +175,12 @@
           <w:color w:val="2563EB"/>
           <w:lang w:val="ru-RU"/>
         </w:rPr>
-        <w:t xml:space="preserve">7.  </w:t>
-      </w:r>
-      <w:r>
-        <w:rPr>
-          <w:lang w:val="ru-RU"/>
-        </w:rPr>
-        <w:t>Додаткові перевірки</w:t>
+        <w:t>6.  Додаткові перевірки</w:t>
+      </w:r>
+      <w:r>
+        <w:rPr>
+          <w:lang w:val="ru-RU"/>
+        </w:rPr>
       </w:r>
     </w:p>
     <w:p>
@@ -200,13 +196,12 @@
           <w:color w:val="2563EB"/>
           <w:lang w:val="ru-RU"/>
         </w:rPr>
-        <w:t xml:space="preserve">8.  </w:t>
-      </w:r>
-      <w:r>
-        <w:rPr>
-          <w:lang w:val="ru-RU"/>
-        </w:rPr>
-        <w:t>Запуск та керування обробкою</w:t>
+        <w:t>7.  Запуск та керування обробкою</w:t>
+      </w:r>
+      <w:r>
+        <w:rPr>
+          <w:lang w:val="ru-RU"/>
+        </w:rPr>
       </w:r>
     </w:p>
     <w:p>
@@ -222,13 +217,12 @@
           <w:color w:val="2563EB"/>
           <w:lang w:val="ru-RU"/>
         </w:rPr>
-        <w:t xml:space="preserve">9.  </w:t>
-      </w:r>
-      <w:r>
-        <w:rPr>
-          <w:lang w:val="ru-RU"/>
-        </w:rPr>
-        <w:t>Результати та звіти</w:t>
+        <w:t>8.  Результати та звіти</w:t>
+      </w:r>
+      <w:r>
+        <w:rPr>
+          <w:lang w:val="ru-RU"/>
+        </w:rPr>
       </w:r>
     </w:p>
     <w:p>
@@ -244,13 +238,12 @@
           <w:color w:val="2563EB"/>
           <w:lang w:val="ru-RU"/>
         </w:rPr>
-        <w:t xml:space="preserve">10.  </w:t>
-      </w:r>
-      <w:r>
-        <w:rPr>
-          <w:lang w:val="ru-RU"/>
-        </w:rPr>
-        <w:t>Конфігураційний файл</w:t>
+        <w:t>9.  Конфігураційний файл</w:t>
+      </w:r>
+      <w:r>
+        <w:rPr>
+          <w:lang w:val="ru-RU"/>
+        </w:rPr>
       </w:r>
     </w:p>
     <w:p>
@@ -266,7 +259,7 @@
           <w:color w:val="2563EB"/>
           <w:lang w:val="ru-RU"/>
         </w:rPr>
-        <w:t>1</w:t>
+        <w:t>10.  Збірка .exe-файлу (PyInstaller)</w:t>
       </w:r>
       <w:r>
         <w:rPr>
@@ -274,7 +267,6 @@
           <w:color w:val="2563EB"/>
           <w:lang w:val="ru-RU"/>
         </w:rPr>
-        <w:t>1</w:t>
       </w:r>
       <w:r>
         <w:rPr>
@@ -282,31 +274,23 @@
           <w:color w:val="2563EB"/>
           <w:lang w:val="ru-RU"/>
         </w:rPr>
-        <w:t xml:space="preserve">.  </w:t>
-      </w:r>
-      <w:r>
-        <w:rPr>
-          <w:lang w:val="ru-RU"/>
-        </w:rPr>
-        <w:t>Збірка .</w:t>
-      </w:r>
-      <w:r>
-        <w:t>exe</w:t>
-      </w:r>
-      <w:r>
-        <w:rPr>
-          <w:lang w:val="ru-RU"/>
-        </w:rPr>
-        <w:t>-файлу (</w:t>
-      </w:r>
-      <w:r>
-        <w:t>PyInstaller</w:t>
-      </w:r>
-      <w:r>
-        <w:rPr>
-          <w:lang w:val="ru-RU"/>
-        </w:rPr>
-        <w:t>)</w:t>
+      </w:r>
+      <w:r>
+        <w:rPr>
+          <w:lang w:val="ru-RU"/>
+        </w:rPr>
+      </w:r>
+      <w:r/>
+      <w:r>
+        <w:rPr>
+          <w:lang w:val="ru-RU"/>
+        </w:rPr>
+      </w:r>
+      <w:r/>
+      <w:r>
+        <w:rPr>
+          <w:lang w:val="ru-RU"/>
+        </w:rPr>
       </w:r>
     </w:p>
     <w:p>
@@ -322,7 +306,7 @@
           <w:color w:val="2563EB"/>
           <w:lang w:val="ru-RU"/>
         </w:rPr>
-        <w:t>1</w:t>
+        <w:t>11.  Часті запитання та усунення неполадок</w:t>
       </w:r>
       <w:r>
         <w:rPr>
@@ -330,7 +314,6 @@
           <w:color w:val="2563EB"/>
           <w:lang w:val="ru-RU"/>
         </w:rPr>
-        <w:t>2</w:t>
       </w:r>
       <w:r>
         <w:rPr>
@@ -338,13 +321,11 @@
           <w:color w:val="2563EB"/>
           <w:lang w:val="ru-RU"/>
         </w:rPr>
-        <w:t xml:space="preserve">.  </w:t>
-      </w:r>
-      <w:r>
-        <w:rPr>
-          <w:lang w:val="ru-RU"/>
-        </w:rPr>
-        <w:t>Часті запитання та усунення неполадок</w:t>
+      </w:r>
+      <w:r>
+        <w:rPr>
+          <w:lang w:val="ru-RU"/>
+        </w:rPr>
       </w:r>
     </w:p>
     <w:p>
@@ -360,7 +341,7 @@
           <w:color w:val="2563EB"/>
           <w:lang w:val="ru-RU"/>
         </w:rPr>
-        <w:t>1</w:t>
+        <w:t>12.  Глосарій</w:t>
       </w:r>
       <w:r>
         <w:rPr>
@@ -368,7 +349,6 @@
           <w:color w:val="2563EB"/>
           <w:lang w:val="ru-RU"/>
         </w:rPr>
-        <w:t>3</w:t>
       </w:r>
       <w:r>
         <w:rPr>
@@ -376,13 +356,11 @@
           <w:color w:val="2563EB"/>
           <w:lang w:val="ru-RU"/>
         </w:rPr>
-        <w:t xml:space="preserve">.  </w:t>
-      </w:r>
-      <w:r>
-        <w:rPr>
-          <w:lang w:val="ru-RU"/>
-        </w:rPr>
-        <w:t>Глосарій</w:t>
+      </w:r>
+      <w:r>
+        <w:rPr>
+          <w:lang w:val="ru-RU"/>
+        </w:rPr>
       </w:r>
     </w:p>
     <w:p>
@@ -627,43 +605,31 @@
         <w:rPr>
           <w:lang w:val="ru-RU"/>
         </w:rPr>
-        <w:t xml:space="preserve">Розпізнавання тексту: російська мова, </w:t>
-      </w:r>
-      <w:r>
-        <w:t>URL</w:t>
-      </w:r>
-      <w:r>
-        <w:rPr>
-          <w:lang w:val="ru-RU"/>
-        </w:rPr>
-        <w:t xml:space="preserve">, </w:t>
-      </w:r>
-      <w:r>
-        <w:t>QR</w:t>
-      </w:r>
-      <w:r>
-        <w:rPr>
-          <w:lang w:val="ru-RU"/>
-        </w:rPr>
-        <w:t xml:space="preserve">-коди (через </w:t>
-      </w:r>
-      <w:r>
-        <w:t>OCR</w:t>
-      </w:r>
-      <w:r>
-        <w:rPr>
-          <w:lang w:val="ru-RU"/>
-        </w:rPr>
-        <w:t xml:space="preserve"> </w:t>
-      </w:r>
-      <w:r>
-        <w:t>Tesseract</w:t>
-      </w:r>
-      <w:r>
-        <w:rPr>
-          <w:lang w:val="ru-RU"/>
-        </w:rPr>
-        <w:t>).</w:t>
+        <w:t>Розпізнавання тексту: російська мова, URL, QR-коди, номери телефонів (через OCR Tesseract).</w:t>
+      </w:r>
+      <w:r/>
+      <w:r>
+        <w:rPr>
+          <w:lang w:val="ru-RU"/>
+        </w:rPr>
+      </w:r>
+      <w:r/>
+      <w:r>
+        <w:rPr>
+          <w:lang w:val="ru-RU"/>
+        </w:rPr>
+      </w:r>
+      <w:r/>
+      <w:r>
+        <w:rPr>
+          <w:lang w:val="ru-RU"/>
+        </w:rPr>
+      </w:r>
+      <w:r/>
+      <w:r>
+        <w:rPr>
+          <w:lang w:val="ru-RU"/>
+        </w:rPr>
       </w:r>
     </w:p>
     <w:p>

</xml_diff>